<commit_message>
feat: add exported lineage diagram as PNG and update documents
</commit_message>
<xml_diff>
--- a/respuestas_gobierno.docx
+++ b/respuestas_gobierno.docx
@@ -2,7 +2,7 @@
 <file path=word/document.xml><?xml version="1.0" encoding="utf-8"?>
 <w:document xmlns:w="http://schemas.openxmlformats.org/wordprocessingml/2006/main" xmlns:m="http://schemas.openxmlformats.org/officeDocument/2006/math" xmlns:r="http://schemas.openxmlformats.org/officeDocument/2006/relationships" xmlns:o="urn:schemas-microsoft-com:office:office" xmlns:v="urn:schemas-microsoft-com:vml" xmlns:w10="urn:schemas-microsoft-com:office:word" xmlns:a="http://schemas.openxmlformats.org/drawingml/2006/main" xmlns:pic="http://schemas.openxmlformats.org/drawingml/2006/picture" xmlns:wp="http://schemas.openxmlformats.org/drawingml/2006/wordprocessingDrawing">
   <w:body>
-    <w:bookmarkStart w:id="34" w:name="Xaeb6f16dc1f941eeb52ea6d768e96fc74e67ed8"/>
+    <w:bookmarkStart w:id="37" w:name="Xaeb6f16dc1f941eeb52ea6d768e96fc74e67ed8"/>
     <w:p>
       <w:pPr>
         <w:pStyle w:val="Heading1"/>
@@ -1266,7 +1266,7 @@
     </w:p>
     <w:bookmarkEnd w:id="27"/>
     <w:bookmarkEnd w:id="28"/>
-    <w:bookmarkStart w:id="32" w:name="b3.-linaje-del-dato-y-controles-en-aws"/>
+    <w:bookmarkStart w:id="35" w:name="b3.-linaje-del-dato-y-controles-en-aws"/>
     <w:p>
       <w:pPr>
         <w:pStyle w:val="Heading2"/>
@@ -1275,7 +1275,7 @@
         <w:t xml:space="preserve">B3. Linaje del dato y controles en AWS</w:t>
       </w:r>
     </w:p>
-    <w:bookmarkStart w:id="29" w:name="Xd38cf565c6d707b648fbab4f8553647b5c087b1"/>
+    <w:bookmarkStart w:id="32" w:name="Xd38cf565c6d707b648fbab4f8553647b5c087b1"/>
     <w:p>
       <w:pPr>
         <w:pStyle w:val="Heading3"/>
@@ -1646,8 +1646,63 @@
         <w:t xml:space="preserve">    I -.-&gt;|"Audita consumo"| H</w:t>
       </w:r>
     </w:p>
-    <w:bookmarkEnd w:id="29"/>
-    <w:bookmarkStart w:id="30" w:name="generación-de-evidencia-de-controles"/>
+    <w:p>
+      <w:pPr>
+        <w:pStyle w:val="CaptionedFigure"/>
+      </w:pPr>
+      <w:r>
+        <w:drawing>
+          <wp:inline>
+            <wp:extent cx="5334000" cy="845343"/>
+            <wp:effectExtent b="0" l="0" r="0" t="0"/>
+            <wp:docPr descr="Diagrama de linaje del dato" title="" id="30" name="Picture"/>
+            <a:graphic>
+              <a:graphicData uri="http://schemas.openxmlformats.org/drawingml/2006/picture">
+                <pic:pic>
+                  <pic:nvPicPr>
+                    <pic:cNvPr descr="lineage_diagram.png" id="31" name="Picture"/>
+                    <pic:cNvPicPr>
+                      <a:picLocks noChangeArrowheads="1" noChangeAspect="1"/>
+                    </pic:cNvPicPr>
+                  </pic:nvPicPr>
+                  <pic:blipFill>
+                    <a:blip r:embed="rId29"/>
+                    <a:stretch>
+                      <a:fillRect/>
+                    </a:stretch>
+                  </pic:blipFill>
+                  <pic:spPr bwMode="auto">
+                    <a:xfrm>
+                      <a:off x="0" y="0"/>
+                      <a:ext cx="5334000" cy="845343"/>
+                    </a:xfrm>
+                    <a:prstGeom prst="rect">
+                      <a:avLst/>
+                    </a:prstGeom>
+                    <a:noFill/>
+                    <a:ln w="9525">
+                      <a:noFill/>
+                      <a:headEnd/>
+                      <a:tailEnd/>
+                    </a:ln>
+                  </pic:spPr>
+                </pic:pic>
+              </a:graphicData>
+            </a:graphic>
+          </wp:inline>
+        </w:drawing>
+      </w:r>
+    </w:p>
+    <w:p>
+      <w:pPr>
+        <w:pStyle w:val="ImageCaption"/>
+      </w:pPr>
+      <w:r>
+        <w:t xml:space="preserve">Diagrama de linaje del dato</w:t>
+      </w:r>
+    </w:p>
+    <w:bookmarkEnd w:id="32"/>
+    <w:bookmarkStart w:id="33" w:name="generación-de-evidencia-de-controles"/>
     <w:p>
       <w:pPr>
         <w:pStyle w:val="Heading3"/>
@@ -1985,8 +2040,8 @@
         </w:tc>
       </w:tr>
     </w:tbl>
-    <w:bookmarkEnd w:id="30"/>
-    <w:bookmarkStart w:id="31" w:name="Xe0e6734fb3151702cd939383362a0abd9c0d9d1"/>
+    <w:bookmarkEnd w:id="33"/>
+    <w:bookmarkStart w:id="34" w:name="Xe0e6734fb3151702cd939383362a0abd9c0d9d1"/>
     <w:p>
       <w:pPr>
         <w:pStyle w:val="Heading3"/>
@@ -2114,9 +2169,9 @@
         </w:pict>
       </w:r>
     </w:p>
-    <w:bookmarkEnd w:id="31"/>
-    <w:bookmarkEnd w:id="32"/>
-    <w:bookmarkStart w:id="33" w:name="X7a0852e1a6f40fc2a452ef9115bbab142f3771c"/>
+    <w:bookmarkEnd w:id="34"/>
+    <w:bookmarkEnd w:id="35"/>
+    <w:bookmarkStart w:id="36" w:name="X7a0852e1a6f40fc2a452ef9115bbab142f3771c"/>
     <w:p>
       <w:pPr>
         <w:pStyle w:val="Heading2"/>
@@ -2443,37 +2498,8 @@
         </w:tc>
       </w:tr>
     </w:tbl>
-    <w:p>
-      <w:r>
-        <w:pict>
-          <v:rect style="width:0;height:1.5pt" o:hralign="center" o:hrstd="t" o:hr="t"/>
-        </w:pict>
-      </w:r>
-    </w:p>
-    <w:p>
-      <w:pPr>
-        <w:pStyle w:val="FirstParagraph"/>
-      </w:pPr>
-      <w:r>
-        <w:rPr>
-          <w:i/>
-          <w:iCs/>
-        </w:rPr>
-        <w:t xml:space="preserve">Documento generado para prueba técnica — HDI Seguros Colombia</w:t>
-      </w:r>
-      <w:r>
-        <w:t xml:space="preserve"> </w:t>
-      </w:r>
-      <w:r>
-        <w:rPr>
-          <w:i/>
-          <w:iCs/>
-        </w:rPr>
-        <w:t xml:space="preserve">Plataforma objetivo: Amazon Redshift | Lenguaje: SQL ANSI + funciones Redshift</w:t>
-      </w:r>
-    </w:p>
-    <w:bookmarkEnd w:id="33"/>
-    <w:bookmarkEnd w:id="34"/>
+    <w:bookmarkEnd w:id="36"/>
+    <w:bookmarkEnd w:id="37"/>
     <w:sectPr/>
   </w:body>
 </w:document>

</xml_diff>